<commit_message>
add base Controller and Reachability
</commit_message>
<xml_diff>
--- a/Prueba Tecnica Raiven.docx
+++ b/Prueba Tecnica Raiven.docx
@@ -142,14 +142,12 @@
         </w:rPr>
         <w:t xml:space="preserve">Se utiliza la arquitectura </w:t>
       </w:r>
-      <w:proofErr w:type="spellStart"/>
-      <w:r>
-        <w:rPr>
-          <w:lang w:val="es-ES"/>
-        </w:rPr>
-        <w:t>viper</w:t>
-      </w:r>
-      <w:proofErr w:type="spellEnd"/>
+      <w:r>
+        <w:rPr>
+          <w:lang w:val="es-ES"/>
+        </w:rPr>
+        <w:t>VIPER</w:t>
+      </w:r>
     </w:p>
     <w:p>
       <w:pPr>
@@ -162,6 +160,109 @@
           <w:lang w:val="es-ES"/>
         </w:rPr>
       </w:pPr>
+      <w:r>
+        <w:rPr>
+          <w:lang w:val="es-ES"/>
+        </w:rPr>
+        <w:t xml:space="preserve">Se utilizan los siguientes </w:t>
+      </w:r>
+      <w:proofErr w:type="spellStart"/>
+      <w:r>
+        <w:rPr>
+          <w:lang w:val="es-ES"/>
+        </w:rPr>
+        <w:t>pods</w:t>
+      </w:r>
+      <w:proofErr w:type="spellEnd"/>
+      <w:r>
+        <w:rPr>
+          <w:lang w:val="es-ES"/>
+        </w:rPr>
+        <w:t>:</w:t>
+      </w:r>
+    </w:p>
+    <w:p>
+      <w:pPr>
+        <w:pStyle w:val="ListParagraph"/>
+        <w:numPr>
+          <w:ilvl w:val="0"/>
+          <w:numId w:val="1"/>
+        </w:numPr>
+        <w:rPr>
+          <w:lang w:val="es-ES"/>
+        </w:rPr>
+      </w:pPr>
+      <w:proofErr w:type="spellStart"/>
+      <w:r>
+        <w:rPr>
+          <w:lang w:val="es-ES"/>
+        </w:rPr>
+        <w:t>ConnectionLayer</w:t>
+      </w:r>
+      <w:proofErr w:type="spellEnd"/>
+      <w:r>
+        <w:rPr>
+          <w:lang w:val="es-ES"/>
+        </w:rPr>
+        <w:t xml:space="preserve">: el cual fue creado por </w:t>
+      </w:r>
+      <w:proofErr w:type="gramStart"/>
+      <w:r>
+        <w:rPr>
+          <w:lang w:val="es-ES"/>
+        </w:rPr>
+        <w:t>mi :para</w:t>
+      </w:r>
+      <w:proofErr w:type="gramEnd"/>
+      <w:r>
+        <w:rPr>
+          <w:lang w:val="es-ES"/>
+        </w:rPr>
+        <w:t xml:space="preserve"> el consumo de peticiones http </w:t>
+      </w:r>
+      <w:hyperlink r:id="rId6" w:history="1">
+        <w:r>
+          <w:rPr>
+            <w:rStyle w:val="Hyperlink"/>
+            <w:lang w:val="es-ES"/>
+          </w:rPr>
+          <w:t>https://cocoapods.org/pods/ConnectionLayer</w:t>
+        </w:r>
+      </w:hyperlink>
+    </w:p>
+    <w:p>
+      <w:pPr>
+        <w:pStyle w:val="ListParagraph"/>
+        <w:numPr>
+          <w:ilvl w:val="0"/>
+          <w:numId w:val="1"/>
+        </w:numPr>
+        <w:rPr>
+          <w:lang w:val="es-ES"/>
+        </w:rPr>
+      </w:pPr>
+      <w:proofErr w:type="spellStart"/>
+      <w:r>
+        <w:rPr>
+          <w:lang w:val="es-ES"/>
+        </w:rPr>
+        <w:t>Lottie</w:t>
+      </w:r>
+      <w:proofErr w:type="spellEnd"/>
+      <w:r>
+        <w:rPr>
+          <w:lang w:val="es-ES"/>
+        </w:rPr>
+        <w:t xml:space="preserve">: animación para el </w:t>
+      </w:r>
+      <w:proofErr w:type="spellStart"/>
+      <w:r>
+        <w:rPr>
+          <w:lang w:val="es-ES"/>
+        </w:rPr>
+        <w:t>loader</w:t>
+      </w:r>
+      <w:proofErr w:type="spellEnd"/>
     </w:p>
     <w:p>
       <w:pPr>

</xml_diff>